<commit_message>
Contestação: inclui precedente do TJMG sobre filha maior em curso superior
Co-Authored-By: Claude Opus 5.5 <noreply@anthropic.com>
Claude-Session: https://claude.ai/code/session_01PkCgfv992vpnGwFiZN4F49
</commit_message>
<xml_diff>
--- a/0801216-88.2026 - Mariah Ritta/Contestação - Mariah Ritta Borges Miranda.docx
+++ b/0801216-88.2026 - Mariah Ritta/Contestação - Mariah Ritta Borges Miranda.docx
@@ -763,6 +763,86 @@
       </w:r>
       <w:r>
         <w:t xml:space="preserve">, em regra até a conclusão do curso, tendo como referência a idade de 24 anos, desde que demonstrada a necessidade.</w:t>
+      </w:r>
+    </w:p>
+    <w:p>
+      <w:pPr>
+        <w:spacing w:after="60" w:line="360"/>
+        <w:ind w:firstLine="850"/>
+        <w:jc w:val="both"/>
+      </w:pPr>
+      <w:r>
+        <w:t xml:space="preserve">No mesmo sentido, a jurisprudência dos tribunais estaduais julga improcedente a exoneração quando a alimentanda, embora maior, cursa ensino superior e não detém condições de se manter:</w:t>
+      </w:r>
+    </w:p>
+    <w:p>
+      <w:pPr>
+        <w:pBdr>
+          <w:top w:val="single" w:color="9AA0A6" w:sz="4" w:space="6"/>
+        </w:pBdr>
+        <w:spacing w:after="0" w:before="160" w:line="240"/>
+        <w:ind w:left="2270" w:right="570"/>
+        <w:jc w:val="both"/>
+      </w:pPr>
+      <w:r>
+        <w:rPr>
+          <w:i/>
+          <w:iCs/>
+          <w:sz w:val="18"/>
+          <w:szCs w:val="18"/>
+        </w:rPr>
+        <w:t xml:space="preserve">EXONERAÇÃO DE ALIMENTOS- MAIORIDADE- CURSO SUPERIOR- MEDICINA- PEDIDO RECONVENÇÃO- MAJORAÇÃO - </w:t>
+      </w:r>
+      <w:r>
+        <w:rPr>
+          <w:i/>
+          <w:iCs/>
+          <w:sz w:val="18"/>
+          <w:szCs w:val="18"/>
+          <w:b/>
+          <w:bCs/>
+          <w:u w:val="single"/>
+          <w:shd w:fill="CFE2F3" w:color="auto" w:val="clear"/>
+        </w:rPr>
+        <w:t xml:space="preserve">Considerando que a alimentanda, malgrado tenha atingido a maioridade, está cursando ensino superior e não detém condições de se manter- exoneração- improcedente.</w:t>
+      </w:r>
+      <w:r>
+        <w:rPr>
+          <w:i/>
+          <w:iCs/>
+          <w:sz w:val="18"/>
+          <w:szCs w:val="18"/>
+        </w:rPr>
+        <w:t xml:space="preserve"> Outrossim, comprovado o aumento da necessidade em função das despesas decorrentes do curso superior de medicina e constatado que o alimentante possui condições de arcar com os alimentos cabe o acolhimento do pedido de majoração da prestação alimentícia- sentença mantida na íntegra.</w:t>
+      </w:r>
+    </w:p>
+    <w:p>
+      <w:pPr>
+        <w:pBdr>
+          <w:bottom w:val="single" w:color="9AA0A6" w:sz="4" w:space="6"/>
+        </w:pBdr>
+        <w:spacing w:after="200" w:before="0" w:line="240"/>
+        <w:ind w:left="2270" w:right="570"/>
+        <w:jc w:val="both"/>
+      </w:pPr>
+      <w:r>
+        <w:rPr>
+          <w:i/>
+          <w:iCs/>
+          <w:sz w:val="18"/>
+          <w:szCs w:val="18"/>
+        </w:rPr>
+        <w:t xml:space="preserve">(TJ-MG - AC: 50052819220218130480, Relator.: Des.(a) Élito Batista de Almeida (JD Convocado), Data de Julgamento: 02/06/2023, Câmara Justiça 4.0 - Especiali, Data de Publicação: 07/06/2023) (grifo nosso)</w:t>
+      </w:r>
+    </w:p>
+    <w:p>
+      <w:pPr>
+        <w:spacing w:after="60" w:line="360"/>
+        <w:ind w:firstLine="850"/>
+        <w:jc w:val="both"/>
+      </w:pPr>
+      <w:r>
+        <w:t xml:space="preserve">É exatamente o caso dos autos: a requerida, recém-ingressa na maioridade, está matriculada em curso de formação e não possui renda própria, de modo que a exoneração não se sustenta.</w:t>
       </w:r>
     </w:p>
     <w:p>

</xml_diff>